<commit_message>
C1: update the proforma for the NGC 7293 Part 2
Removes the five-object choice, pre-fills the three file names, and
replaces the Part 2 prompts with what NGC 7293 is, reading the colours,
and a comparison with visible light.

Co-Authored-By: Claude Opus 5.5 <noreply@anthropic.com>
Claude-Session: https://claude.ai/code/session_01NAwACSWWsG155bmFUMGXxb
</commit_message>
<xml_diff>
--- a/C1/AstroLabC1_Proforma.docx
+++ b/C1/AstroLabC1_Proforma.docx
@@ -87,7 +87,7 @@
         <w:spacing w:after="240"/>
       </w:pPr>
       <w:r>
-        <w:t xml:space="preserve">Complete Part 1 (the Carina Nebula) and Part 2 (your chosen object), then add a short reflection at the end. For each multiple-choice question, put an X in the box next to one answer.</w:t>
+        <w:t xml:space="preserve">Complete Part 1 (the Carina Nebula) and Part 2 (NGC 7293), then add a short reflection at the end. For each multiple-choice question, put an X in the box next to one answer.</w:t>
       </w:r>
     </w:p>
     <w:tbl>
@@ -1512,7 +1512,7 @@
               <w:spacing w:after="0"/>
             </w:pPr>
             <w:r>
-              <w:t xml:space="preserve">Analyzing the impact of ultraviolet radiation on the nebula’s structure.</w:t>
+              <w:t xml:space="preserve">Analysing the impact of ultraviolet radiation on the nebula’s structure.</w:t>
             </w:r>
           </w:p>
         </w:tc>
@@ -1732,352 +1732,8 @@
           <w:sz w:val="26"/>
           <w:szCs w:val="26"/>
         </w:rPr>
-        <w:t xml:space="preserve">Part 2: Your chosen object</w:t>
+        <w:t xml:space="preserve">Part 2: A mystery in infrared</w:t>
       </w:r>
-    </w:p>
-    <w:tbl>
-      <w:tblPr>
-        <w:tblW w:type="dxa" w:w="9638"/>
-        <w:tblBorders>
-          <w:top w:val="single" w:color="auto" w:sz="4"/>
-          <w:left w:val="single" w:color="auto" w:sz="4"/>
-          <w:bottom w:val="single" w:color="auto" w:sz="4"/>
-          <w:right w:val="single" w:color="auto" w:sz="4"/>
-          <w:insideH w:val="single" w:color="auto" w:sz="4"/>
-          <w:insideV w:val="single" w:color="auto" w:sz="4"/>
-        </w:tblBorders>
-      </w:tblPr>
-      <w:tblGrid>
-        <w:gridCol w:w="800"/>
-        <w:gridCol w:w="8838"/>
-      </w:tblGrid>
-      <w:tr>
-        <w:trPr>
-          <w:cantSplit/>
-        </w:trPr>
-        <w:tc>
-          <w:tcPr>
-            <w:tcW w:type="dxa" w:w="9638"/>
-            <w:gridSpan w:val="2"/>
-            <w:tcBorders>
-              <w:top w:val="single" w:color="B7C3D0" w:sz="4"/>
-              <w:left w:val="single" w:color="B7C3D0" w:sz="4"/>
-              <w:bottom w:val="single" w:color="B7C3D0" w:sz="4"/>
-              <w:right w:val="single" w:color="B7C3D0" w:sz="4"/>
-            </w:tcBorders>
-            <w:shd w:fill="E8EEF5" w:color="auto" w:val="clear"/>
-            <w:tcMar>
-              <w:top w:type="dxa" w:w="90"/>
-              <w:left w:type="dxa" w:w="120"/>
-              <w:bottom w:type="dxa" w:w="90"/>
-              <w:right w:type="dxa" w:w="120"/>
-            </w:tcMar>
-          </w:tcPr>
-          <w:p>
-            <w:pPr>
-              <w:keepNext/>
-              <w:spacing w:after="0"/>
-            </w:pPr>
-            <w:r>
-              <w:rPr>
-                <w:b/>
-                <w:bCs/>
-              </w:rPr>
-              <w:t xml:space="preserve">Which object did you choose?</w:t>
-            </w:r>
-          </w:p>
-        </w:tc>
-      </w:tr>
-      <w:tr>
-        <w:trPr>
-          <w:cantSplit/>
-        </w:trPr>
-        <w:tc>
-          <w:tcPr>
-            <w:tcW w:type="dxa" w:w="800"/>
-            <w:tcBorders>
-              <w:top w:val="single" w:color="B7C3D0" w:sz="4"/>
-              <w:left w:val="single" w:color="B7C3D0" w:sz="4"/>
-              <w:bottom w:val="single" w:color="B7C3D0" w:sz="4"/>
-              <w:right w:val="single" w:color="B7C3D0" w:sz="4"/>
-            </w:tcBorders>
-            <w:tcMar>
-              <w:top w:type="dxa" w:w="90"/>
-              <w:left w:type="dxa" w:w="120"/>
-              <w:bottom w:type="dxa" w:w="90"/>
-              <w:right w:type="dxa" w:w="120"/>
-            </w:tcMar>
-            <w:vAlign w:val="center"/>
-          </w:tcPr>
-          <w:p>
-            <w:pPr>
-              <w:keepNext/>
-              <w:spacing w:after="0"/>
-              <w:jc w:val="center"/>
-            </w:pPr>
-          </w:p>
-        </w:tc>
-        <w:tc>
-          <w:tcPr>
-            <w:tcW w:type="dxa" w:w="8838"/>
-            <w:tcBorders>
-              <w:top w:val="single" w:color="B7C3D0" w:sz="4"/>
-              <w:left w:val="single" w:color="B7C3D0" w:sz="4"/>
-              <w:bottom w:val="single" w:color="B7C3D0" w:sz="4"/>
-              <w:right w:val="single" w:color="B7C3D0" w:sz="4"/>
-            </w:tcBorders>
-            <w:tcMar>
-              <w:top w:type="dxa" w:w="90"/>
-              <w:left w:type="dxa" w:w="120"/>
-              <w:bottom w:type="dxa" w:w="90"/>
-              <w:right w:type="dxa" w:w="120"/>
-            </w:tcMar>
-            <w:vAlign w:val="center"/>
-          </w:tcPr>
-          <w:p>
-            <w:pPr>
-              <w:keepNext/>
-              <w:spacing w:after="0"/>
-            </w:pPr>
-            <w:r>
-              <w:t xml:space="preserve">M16 (Eagle Nebula)</w:t>
-            </w:r>
-          </w:p>
-        </w:tc>
-      </w:tr>
-      <w:tr>
-        <w:trPr>
-          <w:cantSplit/>
-        </w:trPr>
-        <w:tc>
-          <w:tcPr>
-            <w:tcW w:type="dxa" w:w="800"/>
-            <w:tcBorders>
-              <w:top w:val="single" w:color="B7C3D0" w:sz="4"/>
-              <w:left w:val="single" w:color="B7C3D0" w:sz="4"/>
-              <w:bottom w:val="single" w:color="B7C3D0" w:sz="4"/>
-              <w:right w:val="single" w:color="B7C3D0" w:sz="4"/>
-            </w:tcBorders>
-            <w:tcMar>
-              <w:top w:type="dxa" w:w="90"/>
-              <w:left w:type="dxa" w:w="120"/>
-              <w:bottom w:type="dxa" w:w="90"/>
-              <w:right w:type="dxa" w:w="120"/>
-            </w:tcMar>
-            <w:vAlign w:val="center"/>
-          </w:tcPr>
-          <w:p>
-            <w:pPr>
-              <w:keepNext/>
-              <w:spacing w:after="0"/>
-              <w:jc w:val="center"/>
-            </w:pPr>
-          </w:p>
-        </w:tc>
-        <w:tc>
-          <w:tcPr>
-            <w:tcW w:type="dxa" w:w="8838"/>
-            <w:tcBorders>
-              <w:top w:val="single" w:color="B7C3D0" w:sz="4"/>
-              <w:left w:val="single" w:color="B7C3D0" w:sz="4"/>
-              <w:bottom w:val="single" w:color="B7C3D0" w:sz="4"/>
-              <w:right w:val="single" w:color="B7C3D0" w:sz="4"/>
-            </w:tcBorders>
-            <w:tcMar>
-              <w:top w:type="dxa" w:w="90"/>
-              <w:left w:type="dxa" w:w="120"/>
-              <w:bottom w:type="dxa" w:w="90"/>
-              <w:right w:type="dxa" w:w="120"/>
-            </w:tcMar>
-            <w:vAlign w:val="center"/>
-          </w:tcPr>
-          <w:p>
-            <w:pPr>
-              <w:keepNext/>
-              <w:spacing w:after="0"/>
-            </w:pPr>
-            <w:r>
-              <w:t xml:space="preserve">NGC 7293 (Helix Nebula)</w:t>
-            </w:r>
-          </w:p>
-        </w:tc>
-      </w:tr>
-      <w:tr>
-        <w:trPr>
-          <w:cantSplit/>
-        </w:trPr>
-        <w:tc>
-          <w:tcPr>
-            <w:tcW w:type="dxa" w:w="800"/>
-            <w:tcBorders>
-              <w:top w:val="single" w:color="B7C3D0" w:sz="4"/>
-              <w:left w:val="single" w:color="B7C3D0" w:sz="4"/>
-              <w:bottom w:val="single" w:color="B7C3D0" w:sz="4"/>
-              <w:right w:val="single" w:color="B7C3D0" w:sz="4"/>
-            </w:tcBorders>
-            <w:tcMar>
-              <w:top w:type="dxa" w:w="90"/>
-              <w:left w:type="dxa" w:w="120"/>
-              <w:bottom w:type="dxa" w:w="90"/>
-              <w:right w:type="dxa" w:w="120"/>
-            </w:tcMar>
-            <w:vAlign w:val="center"/>
-          </w:tcPr>
-          <w:p>
-            <w:pPr>
-              <w:keepNext/>
-              <w:spacing w:after="0"/>
-              <w:jc w:val="center"/>
-            </w:pPr>
-          </w:p>
-        </w:tc>
-        <w:tc>
-          <w:tcPr>
-            <w:tcW w:type="dxa" w:w="8838"/>
-            <w:tcBorders>
-              <w:top w:val="single" w:color="B7C3D0" w:sz="4"/>
-              <w:left w:val="single" w:color="B7C3D0" w:sz="4"/>
-              <w:bottom w:val="single" w:color="B7C3D0" w:sz="4"/>
-              <w:right w:val="single" w:color="B7C3D0" w:sz="4"/>
-            </w:tcBorders>
-            <w:tcMar>
-              <w:top w:type="dxa" w:w="90"/>
-              <w:left w:type="dxa" w:w="120"/>
-              <w:bottom w:type="dxa" w:w="90"/>
-              <w:right w:type="dxa" w:w="120"/>
-            </w:tcMar>
-            <w:vAlign w:val="center"/>
-          </w:tcPr>
-          <w:p>
-            <w:pPr>
-              <w:keepNext/>
-              <w:spacing w:after="0"/>
-            </w:pPr>
-            <w:r>
-              <w:t xml:space="preserve">M51 (Whirlpool Galaxy)</w:t>
-            </w:r>
-          </w:p>
-        </w:tc>
-      </w:tr>
-      <w:tr>
-        <w:trPr>
-          <w:cantSplit/>
-        </w:trPr>
-        <w:tc>
-          <w:tcPr>
-            <w:tcW w:type="dxa" w:w="800"/>
-            <w:tcBorders>
-              <w:top w:val="single" w:color="B7C3D0" w:sz="4"/>
-              <w:left w:val="single" w:color="B7C3D0" w:sz="4"/>
-              <w:bottom w:val="single" w:color="B7C3D0" w:sz="4"/>
-              <w:right w:val="single" w:color="B7C3D0" w:sz="4"/>
-            </w:tcBorders>
-            <w:tcMar>
-              <w:top w:type="dxa" w:w="90"/>
-              <w:left w:type="dxa" w:w="120"/>
-              <w:bottom w:type="dxa" w:w="90"/>
-              <w:right w:type="dxa" w:w="120"/>
-            </w:tcMar>
-            <w:vAlign w:val="center"/>
-          </w:tcPr>
-          <w:p>
-            <w:pPr>
-              <w:keepNext/>
-              <w:spacing w:after="0"/>
-              <w:jc w:val="center"/>
-            </w:pPr>
-          </w:p>
-        </w:tc>
-        <w:tc>
-          <w:tcPr>
-            <w:tcW w:type="dxa" w:w="8838"/>
-            <w:tcBorders>
-              <w:top w:val="single" w:color="B7C3D0" w:sz="4"/>
-              <w:left w:val="single" w:color="B7C3D0" w:sz="4"/>
-              <w:bottom w:val="single" w:color="B7C3D0" w:sz="4"/>
-              <w:right w:val="single" w:color="B7C3D0" w:sz="4"/>
-            </w:tcBorders>
-            <w:tcMar>
-              <w:top w:type="dxa" w:w="90"/>
-              <w:left w:type="dxa" w:w="120"/>
-              <w:bottom w:type="dxa" w:w="90"/>
-              <w:right w:type="dxa" w:w="120"/>
-            </w:tcMar>
-            <w:vAlign w:val="center"/>
-          </w:tcPr>
-          <w:p>
-            <w:pPr>
-              <w:keepNext/>
-              <w:spacing w:after="0"/>
-            </w:pPr>
-            <w:r>
-              <w:t xml:space="preserve">M81 (Bode’s Galaxy)</w:t>
-            </w:r>
-          </w:p>
-        </w:tc>
-      </w:tr>
-      <w:tr>
-        <w:trPr>
-          <w:cantSplit/>
-        </w:trPr>
-        <w:tc>
-          <w:tcPr>
-            <w:tcW w:type="dxa" w:w="800"/>
-            <w:tcBorders>
-              <w:top w:val="single" w:color="B7C3D0" w:sz="4"/>
-              <w:left w:val="single" w:color="B7C3D0" w:sz="4"/>
-              <w:bottom w:val="single" w:color="B7C3D0" w:sz="4"/>
-              <w:right w:val="single" w:color="B7C3D0" w:sz="4"/>
-            </w:tcBorders>
-            <w:tcMar>
-              <w:top w:type="dxa" w:w="90"/>
-              <w:left w:type="dxa" w:w="120"/>
-              <w:bottom w:type="dxa" w:w="90"/>
-              <w:right w:type="dxa" w:w="120"/>
-            </w:tcMar>
-            <w:vAlign w:val="center"/>
-          </w:tcPr>
-          <w:p>
-            <w:pPr>
-              <w:keepNext w:val="false"/>
-              <w:spacing w:after="0"/>
-              <w:jc w:val="center"/>
-            </w:pPr>
-          </w:p>
-        </w:tc>
-        <w:tc>
-          <w:tcPr>
-            <w:tcW w:type="dxa" w:w="8838"/>
-            <w:tcBorders>
-              <w:top w:val="single" w:color="B7C3D0" w:sz="4"/>
-              <w:left w:val="single" w:color="B7C3D0" w:sz="4"/>
-              <w:bottom w:val="single" w:color="B7C3D0" w:sz="4"/>
-              <w:right w:val="single" w:color="B7C3D0" w:sz="4"/>
-            </w:tcBorders>
-            <w:tcMar>
-              <w:top w:type="dxa" w:w="90"/>
-              <w:left w:type="dxa" w:w="120"/>
-              <w:bottom w:type="dxa" w:w="90"/>
-              <w:right w:type="dxa" w:w="120"/>
-            </w:tcMar>
-            <w:vAlign w:val="center"/>
-          </w:tcPr>
-          <w:p>
-            <w:pPr>
-              <w:keepNext w:val="false"/>
-              <w:spacing w:after="0"/>
-            </w:pPr>
-            <w:r>
-              <w:t xml:space="preserve">COSMOS field</w:t>
-            </w:r>
-          </w:p>
-        </w:tc>
-      </w:tr>
-    </w:tbl>
-    <w:p>
-      <w:pPr>
-        <w:spacing w:after="160"/>
-      </w:pPr>
     </w:p>
     <w:p>
       <w:pPr>
@@ -2101,7 +1757,7 @@
         <w:spacing w:after="120"/>
       </w:pPr>
       <w:r>
-        <w:t xml:space="preserve">For each file, record the telescope, the wavelength, what that wavelength mainly shows in your object, and the colour channel you used.</w:t>
+        <w:t xml:space="preserve">For each file, record the telescope, the wavelength, what that wavelength mainly shows in NGC 7293, and the colour channel you used.</w:t>
       </w:r>
     </w:p>
     <w:tbl>
@@ -2324,10 +1980,10 @@
               <w:rPr>
                 <w:b w:val="false"/>
                 <w:bCs w:val="false"/>
-                <w:sz w:val="22"/>
-                <w:szCs w:val="22"/>
-              </w:rPr>
-              <w:t xml:space="preserve"/>
+                <w:sz w:val="17"/>
+                <w:szCs w:val="17"/>
+              </w:rPr>
+              <w:t xml:space="preserve">ngc7293_spitzer_irac_3.6micron.fits.fz</w:t>
             </w:r>
           </w:p>
         </w:tc>
@@ -2490,10 +2146,10 @@
               <w:rPr>
                 <w:b w:val="false"/>
                 <w:bCs w:val="false"/>
-                <w:sz w:val="22"/>
-                <w:szCs w:val="22"/>
-              </w:rPr>
-              <w:t xml:space="preserve"/>
+                <w:sz w:val="17"/>
+                <w:szCs w:val="17"/>
+              </w:rPr>
+              <w:t xml:space="preserve">ngc7293_spitzer_mips_24micron.fits.fz</w:t>
             </w:r>
           </w:p>
         </w:tc>
@@ -2656,10 +2312,10 @@
               <w:rPr>
                 <w:b w:val="false"/>
                 <w:bCs w:val="false"/>
-                <w:sz w:val="22"/>
-                <w:szCs w:val="22"/>
-              </w:rPr>
-              <w:t xml:space="preserve"/>
+                <w:sz w:val="17"/>
+                <w:szCs w:val="17"/>
+              </w:rPr>
+              <w:t xml:space="preserve">ngc7293_herschel_spire_250micron.fits.fz</w:t>
             </w:r>
           </w:p>
         </w:tc>
@@ -2889,7 +2545,7 @@
           <w:sz w:val="23"/>
           <w:szCs w:val="23"/>
         </w:rPr>
-        <w:t xml:space="preserve">About your object</w:t>
+        <w:t xml:space="preserve">What is NGC 7293?</w:t>
       </w:r>
     </w:p>
     <w:p>
@@ -2898,7 +2554,7 @@
         <w:spacing w:after="120"/>
       </w:pPr>
       <w:r>
-        <w:t xml:space="preserve">In three or four sentences: what is your object, roughly how far away is it, and what do the colours in your image show?</w:t>
+        <w:t xml:space="preserve">In three or four sentences: what kind of object is NGC 7293, roughly how far away is it, how did it form, and what’s at its centre? List the sources you used.</w:t>
       </w:r>
     </w:p>
     <w:tbl>
@@ -2966,7 +2622,7 @@
           <w:sz w:val="23"/>
           <w:szCs w:val="23"/>
         </w:rPr>
-        <w:t xml:space="preserve">Comparison</w:t>
+        <w:t xml:space="preserve">Reading the colours</w:t>
       </w:r>
     </w:p>
     <w:p>
@@ -2975,7 +2631,7 @@
         <w:spacing w:after="120"/>
       </w:pPr>
       <w:r>
-        <w:t xml:space="preserve">Find another image of your object online. Where did you find it, how does your image look different, and why might that be (for example, different telescopes, wavelengths, colour choices or processing)?</w:t>
+        <w:t xml:space="preserve">Where does each colour appear in your image? Is the same structure visible in all three channels? What’s in the very centre, and what’s further out? Explain what each colour shows you, and what that says about the temperature of the material and the object’s history.</w:t>
       </w:r>
     </w:p>
     <w:tbl>
@@ -3033,6 +2689,83 @@
     <w:p>
       <w:pPr>
         <w:keepNext/>
+        <w:spacing w:after="100" w:before="200"/>
+      </w:pPr>
+      <w:r>
+        <w:rPr>
+          <w:b/>
+          <w:bCs/>
+          <w:color w:val="003B71"/>
+          <w:sz w:val="23"/>
+          <w:szCs w:val="23"/>
+        </w:rPr>
+        <w:t xml:space="preserve">Comparison with visible light</w:t>
+      </w:r>
+    </w:p>
+    <w:p>
+      <w:pPr>
+        <w:keepNext/>
+        <w:spacing w:after="120"/>
+      </w:pPr>
+      <w:r>
+        <w:t xml:space="preserve">Find a visible-light image of NGC 7293 (for example, from the Hubble Space Telescope). Where did you find it, how does it look different from your image, and what does each one reveal that the other can’t? Why do some of your three channels look blurrier than others?</w:t>
+      </w:r>
+    </w:p>
+    <w:tbl>
+      <w:tblPr>
+        <w:tblW w:type="dxa" w:w="9638"/>
+        <w:tblBorders>
+          <w:top w:val="single" w:color="auto" w:sz="4"/>
+          <w:left w:val="single" w:color="auto" w:sz="4"/>
+          <w:bottom w:val="single" w:color="auto" w:sz="4"/>
+          <w:right w:val="single" w:color="auto" w:sz="4"/>
+          <w:insideH w:val="single" w:color="auto" w:sz="4"/>
+          <w:insideV w:val="single" w:color="auto" w:sz="4"/>
+        </w:tblBorders>
+      </w:tblPr>
+      <w:tblGrid>
+        <w:gridCol w:w="9638"/>
+      </w:tblGrid>
+      <w:tr>
+        <w:trPr>
+          <w:trHeight w:val="2400" w:hRule="atLeast"/>
+        </w:trPr>
+        <w:tc>
+          <w:tcPr>
+            <w:tcW w:type="dxa" w:w="9638"/>
+            <w:tcBorders>
+              <w:top w:val="single" w:color="B7C3D0" w:sz="4"/>
+              <w:left w:val="single" w:color="B7C3D0" w:sz="4"/>
+              <w:bottom w:val="single" w:color="B7C3D0" w:sz="4"/>
+              <w:right w:val="single" w:color="B7C3D0" w:sz="4"/>
+            </w:tcBorders>
+            <w:tcMar>
+              <w:top w:type="dxa" w:w="90"/>
+              <w:left w:type="dxa" w:w="120"/>
+              <w:bottom w:type="dxa" w:w="90"/>
+              <w:right w:type="dxa" w:w="120"/>
+            </w:tcMar>
+            <w:vAlign w:val="top"/>
+          </w:tcPr>
+          <w:p>
+            <w:pPr>
+              <w:spacing w:after="0"/>
+            </w:pPr>
+            <w:r>
+              <w:rPr>
+                <w:i/>
+                <w:iCs/>
+                <w:color w:val="8A8A8A"/>
+              </w:rPr>
+              <w:t xml:space="preserve">Type your answer here</w:t>
+            </w:r>
+          </w:p>
+        </w:tc>
+      </w:tr>
+    </w:tbl>
+    <w:p>
+      <w:pPr>
+        <w:keepNext/>
         <w:pBdr>
           <w:bottom w:val="single" w:color="003B71" w:sz="6" w:space="4"/>
         </w:pBdr>
@@ -3055,7 +2788,7 @@
         <w:spacing w:after="120"/>
       </w:pPr>
       <w:r>
-        <w:t xml:space="preserve">In one or two sentences: are your images true colour or representative colour, and what would a visible-light image of these objects miss?</w:t>
+        <w:t xml:space="preserve">In one or two sentences: are your images true colour or representative colour, and why do astronomers make colour images from wavelengths our eyes can’t see?</w:t>
       </w:r>
     </w:p>
     <w:tbl>

</xml_diff>